<commit_message>
fix(renderer): 修复 formula OMML 命名空间缺失导致文档 XML 无效
- renderer.py: save 前防御性添加 xmlns:m 命名空间声明，确保 formula
  block 插入的 <m:oMath> 不会在 docxtpl 合并 subdoc 后导致 XML 解析错误
- build_test_template.py: 生成模板时同步添加 xmlns:m，并为章节标题
  应用 Heading 1 样式
- verify_issue4.yaml / test_all_blocks.json: 移除 subdoc_title，避免
  与模板硬编码标题重复

Co-Authored-By: Claude Opus 4.7 <noreply@anthropic.com>
</commit_message>
<xml_diff>
--- a/templates/test_all_blocks.docx
+++ b/templates/test_all_blocks.docx
@@ -36,6 +36,14 @@
       </w:r>
     </w:p>
     <w:p>
+      <w:pPr>
+        <w:pStyle w:val="Heading1"/>
+      </w:pPr>
+      <w:r>
+        <w:t>目 录</w:t>
+      </w:r>
+    </w:p>
+    <w:p>
       <w:r>
         <w:t>{{p TOC_SUBDOC }}</w:t>
       </w:r>
@@ -56,6 +64,9 @@
       </w:r>
     </w:p>
     <w:p>
+      <w:pPr>
+        <w:pStyle w:val="Heading1"/>
+      </w:pPr>
       <w:r>
         <w:t>一、研究内容与技术路线</w:t>
       </w:r>
@@ -76,6 +87,9 @@
       </w:r>
     </w:p>
     <w:p>
+      <w:pPr>
+        <w:pStyle w:val="Heading1"/>
+      </w:pPr>
       <w:r>
         <w:t>二、研究基础与条件保障</w:t>
       </w:r>
@@ -96,6 +110,9 @@
       </w:r>
     </w:p>
     <w:p>
+      <w:pPr>
+        <w:pStyle w:val="Heading1"/>
+      </w:pPr>
       <w:r>
         <w:t>三、实施计划与进度安排</w:t>
       </w:r>
@@ -116,6 +133,9 @@
       </w:r>
     </w:p>
     <w:p>
+      <w:pPr>
+        <w:pStyle w:val="Heading1"/>
+      </w:pPr>
       <w:r>
         <w:t>附件</w:t>
       </w:r>

</xml_diff>

<commit_message>
fix(template): 清除 Heading 样式的 theme 字体属性，使 eastAsia 字体生效
内置 Heading 样式默认带有 eastAsiaTheme/asciiTheme 等 theme 属性，
Word 会优先使用主题字体而忽略直接指定的 eastAsia="黑体"。
在 add_paragraph_style 中设置 eastAsia 字体时，同步清除 theme
属性，确保中文字体正确生效。

Co-Authored-By: Claude Opus 4.7 <noreply@anthropic.com>
</commit_message>
<xml_diff>
--- a/templates/test_all_blocks.docx
+++ b/templates/test_all_blocks.docx
@@ -584,7 +584,7 @@
       <w:outlineLvl w:val="0"/>
     </w:pPr>
     <w:rPr>
-      <w:rFonts w:asciiTheme="majorHAnsi" w:eastAsiaTheme="majorEastAsia" w:hAnsiTheme="majorHAnsi" w:cstheme="majorBidi" w:eastAsia="黑体"/>
+      <w:rFonts w:eastAsia="黑体"/>
       <w:b/>
       <w:bCs/>
       <w:color w:val="365F91" w:themeColor="accent1" w:themeShade="BF"/>
@@ -608,7 +608,7 @@
       <w:outlineLvl w:val="1"/>
     </w:pPr>
     <w:rPr>
-      <w:rFonts w:asciiTheme="majorHAnsi" w:eastAsiaTheme="majorEastAsia" w:hAnsiTheme="majorHAnsi" w:cstheme="majorBidi" w:eastAsia="黑体"/>
+      <w:rFonts w:eastAsia="黑体"/>
       <w:b/>
       <w:bCs/>
       <w:color w:val="4F81BD" w:themeColor="accent1"/>
@@ -632,7 +632,7 @@
       <w:outlineLvl w:val="2"/>
     </w:pPr>
     <w:rPr>
-      <w:rFonts w:asciiTheme="majorHAnsi" w:eastAsiaTheme="majorEastAsia" w:hAnsiTheme="majorHAnsi" w:cstheme="majorBidi" w:eastAsia="宋体"/>
+      <w:rFonts w:eastAsia="宋体"/>
       <w:b/>
       <w:bCs/>
       <w:color w:val="4F81BD" w:themeColor="accent1"/>

</xml_diff>

<commit_message>
chore(template): regenerate test_all_blocks.docx with TableCaption/FigureCaption
Regenerate the test template after splitting Caption into two
independent styles (TableCaption for table titles, FigureCaption
for image/formula captions).

Co-Authored-By: Claude Opus 4.7 <noreply@anthropic.com>
</commit_message>
<xml_diff>
--- a/templates/test_all_blocks.docx
+++ b/templates/test_all_blocks.docx
@@ -1324,15 +1324,13 @@
     <w:qFormat/>
     <w:rsid w:val="00FC693F"/>
     <w:pPr>
-      <w:spacing w:line="360" w:lineRule="atLeast" w:before="360" w:after="0"/>
-      <w:jc w:val="center"/>
+      <w:spacing w:line="240" w:lineRule="auto"/>
     </w:pPr>
     <w:rPr>
-      <w:rFonts w:eastAsia="黑体"/>
       <w:b/>
       <w:bCs/>
       <w:color w:val="4F81BD" w:themeColor="accent1"/>
-      <w:sz w:val="21"/>
+      <w:sz w:val="18"/>
       <w:szCs w:val="18"/>
     </w:rPr>
   </w:style>
@@ -12220,6 +12218,30 @@
         <w:shd w:val="clear" w:color="auto" w:fill="FBCAA2" w:themeFill="accent6" w:themeFillTint="7F"/>
       </w:tcPr>
     </w:tblStylePr>
+  </w:style>
+  <w:style w:type="paragraph" w:customStyle="1" w:styleId="TableCaption">
+    <w:name w:val="TableCaption"/>
+    <w:pPr>
+      <w:spacing w:before="360" w:after="0" w:lineRule="atLeast" w:line="360"/>
+      <w:jc w:val="center"/>
+    </w:pPr>
+    <w:rPr>
+      <w:rFonts w:eastAsia="黑体"/>
+      <w:b/>
+      <w:sz w:val="21"/>
+    </w:rPr>
+  </w:style>
+  <w:style w:type="paragraph" w:customStyle="1" w:styleId="FigureCaption">
+    <w:name w:val="FigureCaption"/>
+    <w:pPr>
+      <w:spacing w:before="0" w:after="360" w:lineRule="atLeast" w:line="360"/>
+      <w:jc w:val="center"/>
+    </w:pPr>
+    <w:rPr>
+      <w:rFonts w:eastAsia="黑体"/>
+      <w:b/>
+      <w:sz w:val="21"/>
+    </w:rPr>
   </w:style>
   <w:style w:type="paragraph" w:customStyle="1" w:styleId="Legend">
     <w:name w:val="Legend"/>

</xml_diff>